<commit_message>
Keep the proposal template's own measurements by default
The department's layout is now reproduced exactly as issued, including the
places where it prints outside the margins it declares: ind right="-630" on
the reference paragraphs, tblInd="-318" on the tables, and an upper-roman
list whose right-aligned label lets VIII. grow past the left margin.

Rendering the untouched template confirms it behaves the same way -- its own
sample references reach x=571pt on a page whose right margin is 540pt -- so
matching it is a fidelity decision, not a defect.

--fit-margins restores the earlier corrections for anyone who wants them.
</commit_message>
<xml_diff>
--- a/output/paper/Project_Proposal.docx
+++ b/output/paper/Project_Proposal.docx
@@ -4,7 +4,7 @@
   <w:body>
     <w:p>
       <w:pPr>
-        <w:ind w:left="0" w:right="0"/>
+        <w:ind w:left="-540" w:right="-630"/>
         <w:jc w:val="center"/>
         <w:rPr>
           <w:rFonts w:ascii="Times New Roman" w:hAnsi="Times New Roman" w:cs="Times New Roman"/>
@@ -31,7 +31,7 @@
     </w:p>
     <w:p>
       <w:pPr>
-        <w:ind w:left="0" w:right="0"/>
+        <w:ind w:left="-540" w:right="-630"/>
         <w:rPr>
           <w:rFonts w:ascii="Times New Roman" w:hAnsi="Times New Roman" w:cs="Times New Roman"/>
           <w:b/>
@@ -41,7 +41,7 @@
     </w:p>
     <w:p>
       <w:pPr>
-        <w:ind w:left="0" w:right="0"/>
+        <w:ind w:left="-540" w:right="-630"/>
         <w:jc w:val="center"/>
         <w:rPr>
           <w:rFonts w:ascii="Times New Roman" w:hAnsi="Times New Roman" w:cs="Times New Roman"/>
@@ -60,7 +60,7 @@
     </w:p>
     <w:p>
       <w:pPr>
-        <w:ind w:left="0" w:right="0"/>
+        <w:ind w:left="-540" w:right="-630"/>
         <w:jc w:val="center"/>
         <w:rPr>
           <w:rFonts w:ascii="Times New Roman" w:hAnsi="Times New Roman" w:cs="Times New Roman"/>
@@ -70,7 +70,7 @@
     </w:p>
     <w:p>
       <w:pPr>
-        <w:ind w:left="0" w:right="0"/>
+        <w:ind w:left="-540" w:right="-630"/>
         <w:jc w:val="center"/>
         <w:rPr>
           <w:rFonts w:ascii="Times New Roman" w:hAnsi="Times New Roman" w:cs="Times New Roman"/>
@@ -94,7 +94,7 @@
     </w:p>
     <w:p>
       <w:pPr>
-        <w:ind w:left="0" w:right="0"/>
+        <w:ind w:left="-540" w:right="-630"/>
         <w:jc w:val="center"/>
         <w:rPr>
           <w:rFonts w:ascii="Times New Roman" w:hAnsi="Times New Roman" w:cs="Times New Roman"/>
@@ -121,7 +121,7 @@
     </w:p>
     <w:p>
       <w:pPr>
-        <w:ind w:left="0" w:right="0"/>
+        <w:ind w:left="-540" w:right="-630"/>
         <w:jc w:val="center"/>
         <w:rPr>
           <w:rFonts w:ascii="Times New Roman" w:hAnsi="Times New Roman" w:cs="Times New Roman"/>
@@ -132,7 +132,7 @@
     </w:p>
     <w:p>
       <w:pPr>
-        <w:ind w:left="0" w:right="0"/>
+        <w:ind w:left="-540" w:right="-630"/>
         <w:jc w:val="center"/>
         <w:rPr>
           <w:rFonts w:ascii="Times New Roman" w:hAnsi="Times New Roman" w:cs="Times New Roman"/>
@@ -149,7 +149,7 @@
     </w:p>
     <w:p>
       <w:pPr>
-        <w:ind w:left="0" w:right="0"/>
+        <w:ind w:left="-540" w:right="-630"/>
         <w:jc w:val="center"/>
         <w:rPr>
           <w:rFonts w:ascii="Times New Roman" w:hAnsi="Times New Roman" w:cs="Times New Roman"/>
@@ -168,7 +168,7 @@
     </w:p>
     <w:p>
       <w:pPr>
-        <w:ind w:left="0" w:right="0"/>
+        <w:ind w:left="-540" w:right="-630"/>
         <w:jc w:val="center"/>
         <w:rPr>
           <w:rFonts w:ascii="Times New Roman" w:hAnsi="Times New Roman" w:cs="Times New Roman"/>
@@ -233,7 +233,7 @@
     </w:p>
     <w:p>
       <w:pPr>
-        <w:ind w:left="0" w:right="0"/>
+        <w:ind w:left="-540" w:right="-630"/>
         <w:jc w:val="center"/>
         <w:rPr>
           <w:rFonts w:ascii="Times New Roman" w:hAnsi="Times New Roman" w:cs="Times New Roman"/>
@@ -243,7 +243,7 @@
     </w:p>
     <w:p>
       <w:pPr>
-        <w:ind w:left="0" w:right="0"/>
+        <w:ind w:left="-540" w:right="-630"/>
         <w:jc w:val="center"/>
         <w:rPr>
           <w:rFonts w:ascii="Times New Roman" w:hAnsi="Times New Roman" w:cs="Times New Roman"/>
@@ -267,7 +267,7 @@
     </w:p>
     <w:p>
       <w:pPr>
-        <w:ind w:left="0" w:right="0"/>
+        <w:ind w:left="-540" w:right="-630"/>
         <w:jc w:val="center"/>
         <w:rPr>
           <w:rFonts w:ascii="Times New Roman" w:hAnsi="Times New Roman" w:cs="Times New Roman"/>
@@ -284,7 +284,7 @@
     </w:p>
     <w:p>
       <w:pPr>
-        <w:ind w:left="0" w:right="0"/>
+        <w:ind w:left="-540" w:right="-630"/>
         <w:jc w:val="center"/>
         <w:rPr>
           <w:rFonts w:ascii="Times New Roman" w:hAnsi="Times New Roman" w:cs="Times New Roman"/>
@@ -294,7 +294,7 @@
     </w:p>
     <w:p>
       <w:pPr>
-        <w:ind w:left="0" w:right="0"/>
+        <w:ind w:left="-540" w:right="-630"/>
         <w:jc w:val="center"/>
         <w:rPr>
           <w:rFonts w:ascii="Times New Roman" w:hAnsi="Times New Roman" w:cs="Times New Roman"/>
@@ -311,7 +311,7 @@
     </w:p>
     <w:p>
       <w:pPr>
-        <w:ind w:left="0" w:right="0"/>
+        <w:ind w:left="-540" w:right="-630"/>
         <w:jc w:val="center"/>
         <w:rPr>
           <w:rFonts w:ascii="Times New Roman" w:hAnsi="Times New Roman" w:cs="Times New Roman"/>
@@ -332,7 +332,7 @@
     </w:p>
     <w:p>
       <w:pPr>
-        <w:ind w:left="0" w:right="0"/>
+        <w:ind w:left="-540" w:right="-630"/>
         <w:jc w:val="center"/>
         <w:rPr>
           <w:rFonts w:ascii="Times New Roman" w:hAnsi="Times New Roman" w:cs="Times New Roman"/>
@@ -359,7 +359,7 @@
     </w:p>
     <w:p>
       <w:pPr>
-        <w:ind w:left="0" w:right="0"/>
+        <w:ind w:left="-540" w:right="-630"/>
         <w:jc w:val="center"/>
         <w:rPr>
           <w:rFonts w:ascii="Times New Roman" w:hAnsi="Times New Roman" w:cs="Times New Roman"/>
@@ -370,7 +370,7 @@
     </w:p>
     <w:p>
       <w:pPr>
-        <w:ind w:left="0" w:right="0"/>
+        <w:ind w:left="-540" w:right="-630"/>
         <w:jc w:val="center"/>
         <w:rPr>
           <w:rFonts w:ascii="Times New Roman" w:hAnsi="Times New Roman" w:cs="Times New Roman"/>
@@ -381,7 +381,7 @@
     </w:p>
     <w:p>
       <w:pPr>
-        <w:ind w:left="0" w:right="0"/>
+        <w:ind w:left="-540" w:right="-630"/>
         <w:jc w:val="center"/>
         <w:rPr>
           <w:rFonts w:ascii="Times New Roman" w:hAnsi="Times New Roman" w:cs="Times New Roman"/>
@@ -497,24 +497,23 @@
     <w:tbl>
       <w:tblPr>
         <w:tblStyle w:val="TableGrid"/>
-        <w:tblW w:w="9360" w:type="dxa"/>
-        <w:tblInd w:w="0" w:type="dxa"/>
-        <w:tblLayout w:type="fixed"/>
+        <w:tblW w:w="10207" w:type="dxa"/>
+        <w:tblInd w:w="-318" w:type="dxa"/>
         <w:tblLook w:val="04A0" w:firstRow="1" w:lastRow="0" w:firstColumn="1" w:lastColumn="0" w:noHBand="0" w:noVBand="1"/>
       </w:tblPr>
       <w:tblGrid>
-        <w:gridCol w:w="1290"/>
-        <w:gridCol w:w="589"/>
-        <w:gridCol w:w="2435"/>
-        <w:gridCol w:w="1311"/>
-        <w:gridCol w:w="1534"/>
-        <w:gridCol w:w="1293"/>
-        <w:gridCol w:w="908"/>
+        <w:gridCol w:w="1407"/>
+        <w:gridCol w:w="643"/>
+        <w:gridCol w:w="2656"/>
+        <w:gridCol w:w="1430"/>
+        <w:gridCol w:w="1673"/>
+        <w:gridCol w:w="1411"/>
+        <w:gridCol w:w="987"/>
       </w:tblGrid>
       <w:tr>
         <w:tc>
           <w:tcPr>
-            <w:tcW w:w="1290" w:type="dxa"/>
+            <w:tcW w:w="1417" w:type="dxa"/>
           </w:tcPr>
           <w:p>
             <w:pPr>
@@ -536,7 +535,7 @@
         </w:tc>
         <w:tc>
           <w:tcPr>
-            <w:tcW w:w="589" w:type="dxa"/>
+            <w:tcW w:w="579" w:type="dxa"/>
           </w:tcPr>
           <w:p>
             <w:pPr>
@@ -558,7 +557,7 @@
         </w:tc>
         <w:tc>
           <w:tcPr>
-            <w:tcW w:w="2435" w:type="dxa"/>
+            <w:tcW w:w="2683" w:type="dxa"/>
           </w:tcPr>
           <w:p>
             <w:pPr>
@@ -580,7 +579,7 @@
         </w:tc>
         <w:tc>
           <w:tcPr>
-            <w:tcW w:w="1311" w:type="dxa"/>
+            <w:tcW w:w="1433" w:type="dxa"/>
           </w:tcPr>
           <w:p>
             <w:pPr>
@@ -602,7 +601,7 @@
         </w:tc>
         <w:tc>
           <w:tcPr>
-            <w:tcW w:w="1534" w:type="dxa"/>
+            <w:tcW w:w="1685" w:type="dxa"/>
           </w:tcPr>
           <w:p>
             <w:pPr>
@@ -624,7 +623,7 @@
         </w:tc>
         <w:tc>
           <w:tcPr>
-            <w:tcW w:w="1293" w:type="dxa"/>
+            <w:tcW w:w="1418" w:type="dxa"/>
           </w:tcPr>
           <w:p>
             <w:pPr>
@@ -646,7 +645,7 @@
         </w:tc>
         <w:tc>
           <w:tcPr>
-            <w:tcW w:w="908" w:type="dxa"/>
+            <w:tcW w:w="992" w:type="dxa"/>
           </w:tcPr>
           <w:p>
             <w:pPr>
@@ -670,7 +669,7 @@
       <w:tr>
         <w:tc>
           <w:tcPr>
-            <w:tcW w:w="1290" w:type="dxa"/>
+            <w:tcW w:w="1417" w:type="dxa"/>
           </w:tcPr>
           <w:p>
             <w:pPr>
@@ -693,7 +692,7 @@
         </w:tc>
         <w:tc>
           <w:tcPr>
-            <w:tcW w:w="589" w:type="dxa"/>
+            <w:tcW w:w="579" w:type="dxa"/>
           </w:tcPr>
           <w:p>
             <w:pPr>
@@ -707,7 +706,7 @@
         </w:tc>
         <w:tc>
           <w:tcPr>
-            <w:tcW w:w="2435" w:type="dxa"/>
+            <w:tcW w:w="2683" w:type="dxa"/>
           </w:tcPr>
           <w:p>
             <w:pPr>
@@ -721,7 +720,7 @@
         </w:tc>
         <w:tc>
           <w:tcPr>
-            <w:tcW w:w="1311" w:type="dxa"/>
+            <w:tcW w:w="1433" w:type="dxa"/>
           </w:tcPr>
           <w:p>
             <w:pPr>
@@ -735,7 +734,7 @@
         </w:tc>
         <w:tc>
           <w:tcPr>
-            <w:tcW w:w="1534" w:type="dxa"/>
+            <w:tcW w:w="1685" w:type="dxa"/>
           </w:tcPr>
           <w:p>
             <w:pPr>
@@ -749,7 +748,7 @@
         </w:tc>
         <w:tc>
           <w:tcPr>
-            <w:tcW w:w="1293" w:type="dxa"/>
+            <w:tcW w:w="1418" w:type="dxa"/>
           </w:tcPr>
           <w:p>
             <w:pPr>
@@ -763,7 +762,7 @@
         </w:tc>
         <w:tc>
           <w:tcPr>
-            <w:tcW w:w="908" w:type="dxa"/>
+            <w:tcW w:w="992" w:type="dxa"/>
           </w:tcPr>
           <w:p>
             <w:pPr>
@@ -779,7 +778,7 @@
       <w:tr>
         <w:tc>
           <w:tcPr>
-            <w:tcW w:w="1290" w:type="dxa"/>
+            <w:tcW w:w="1417" w:type="dxa"/>
           </w:tcPr>
           <w:p>
             <w:pPr>
@@ -802,7 +801,7 @@
         </w:tc>
         <w:tc>
           <w:tcPr>
-            <w:tcW w:w="589" w:type="dxa"/>
+            <w:tcW w:w="579" w:type="dxa"/>
           </w:tcPr>
           <w:p>
             <w:pPr>
@@ -816,7 +815,7 @@
         </w:tc>
         <w:tc>
           <w:tcPr>
-            <w:tcW w:w="2435" w:type="dxa"/>
+            <w:tcW w:w="2683" w:type="dxa"/>
           </w:tcPr>
           <w:p>
             <w:pPr>
@@ -830,7 +829,7 @@
         </w:tc>
         <w:tc>
           <w:tcPr>
-            <w:tcW w:w="1311" w:type="dxa"/>
+            <w:tcW w:w="1433" w:type="dxa"/>
           </w:tcPr>
           <w:p>
             <w:pPr>
@@ -844,7 +843,7 @@
         </w:tc>
         <w:tc>
           <w:tcPr>
-            <w:tcW w:w="1534" w:type="dxa"/>
+            <w:tcW w:w="1685" w:type="dxa"/>
           </w:tcPr>
           <w:p>
             <w:pPr>
@@ -858,7 +857,7 @@
         </w:tc>
         <w:tc>
           <w:tcPr>
-            <w:tcW w:w="1293" w:type="dxa"/>
+            <w:tcW w:w="1418" w:type="dxa"/>
           </w:tcPr>
           <w:p>
             <w:pPr>
@@ -872,7 +871,7 @@
         </w:tc>
         <w:tc>
           <w:tcPr>
-            <w:tcW w:w="908" w:type="dxa"/>
+            <w:tcW w:w="992" w:type="dxa"/>
           </w:tcPr>
           <w:p>
             <w:pPr>
@@ -888,7 +887,7 @@
       <w:tr>
         <w:tc>
           <w:tcPr>
-            <w:tcW w:w="1290" w:type="dxa"/>
+            <w:tcW w:w="1417" w:type="dxa"/>
           </w:tcPr>
           <w:p>
             <w:pPr>
@@ -911,7 +910,7 @@
         </w:tc>
         <w:tc>
           <w:tcPr>
-            <w:tcW w:w="589" w:type="dxa"/>
+            <w:tcW w:w="579" w:type="dxa"/>
           </w:tcPr>
           <w:p>
             <w:pPr>
@@ -925,7 +924,7 @@
         </w:tc>
         <w:tc>
           <w:tcPr>
-            <w:tcW w:w="2435" w:type="dxa"/>
+            <w:tcW w:w="2683" w:type="dxa"/>
           </w:tcPr>
           <w:p>
             <w:pPr>
@@ -939,7 +938,7 @@
         </w:tc>
         <w:tc>
           <w:tcPr>
-            <w:tcW w:w="1311" w:type="dxa"/>
+            <w:tcW w:w="1433" w:type="dxa"/>
           </w:tcPr>
           <w:p>
             <w:pPr>
@@ -953,7 +952,7 @@
         </w:tc>
         <w:tc>
           <w:tcPr>
-            <w:tcW w:w="1534" w:type="dxa"/>
+            <w:tcW w:w="1685" w:type="dxa"/>
           </w:tcPr>
           <w:p>
             <w:pPr>
@@ -967,7 +966,7 @@
         </w:tc>
         <w:tc>
           <w:tcPr>
-            <w:tcW w:w="1293" w:type="dxa"/>
+            <w:tcW w:w="1418" w:type="dxa"/>
           </w:tcPr>
           <w:p>
             <w:pPr>
@@ -981,7 +980,7 @@
         </w:tc>
         <w:tc>
           <w:tcPr>
-            <w:tcW w:w="908" w:type="dxa"/>
+            <w:tcW w:w="992" w:type="dxa"/>
           </w:tcPr>
           <w:p>
             <w:pPr>
@@ -1248,8 +1247,7 @@
         </w:tabs>
         <w:autoSpaceDE w:val="0"/>
         <w:autoSpaceDN w:val="0"/>
-        <w:spacing w:before="42" w:after="120" w:line="240" w:lineRule="auto"/>
-        <w:ind w:left="720" w:hanging="120"/>
+        <w:spacing w:before="42" w:after="0" w:line="240" w:lineRule="auto"/>
         <w:rPr>
           <w:rFonts w:ascii="Times New Roman" w:hAnsi="Times New Roman" w:cs="Times New Roman"/>
           <w:b/>
@@ -1419,8 +1417,7 @@
         </w:tabs>
         <w:autoSpaceDE w:val="0"/>
         <w:autoSpaceDN w:val="0"/>
-        <w:spacing w:before="42" w:after="120" w:line="240" w:lineRule="auto"/>
-        <w:ind w:left="720" w:hanging="120"/>
+        <w:spacing w:before="42" w:after="0" w:line="240" w:lineRule="auto"/>
         <w:rPr>
           <w:rFonts w:ascii="Times New Roman" w:hAnsi="Times New Roman" w:cs="Times New Roman"/>
           <w:b/>
@@ -1985,8 +1982,7 @@
         </w:tabs>
         <w:autoSpaceDE w:val="0"/>
         <w:autoSpaceDN w:val="0"/>
-        <w:spacing w:before="42" w:after="120" w:line="240" w:lineRule="auto"/>
-        <w:ind w:left="720" w:hanging="120"/>
+        <w:spacing w:before="42" w:after="0" w:line="240" w:lineRule="auto"/>
         <w:rPr>
           <w:rFonts w:ascii="Times New Roman" w:hAnsi="Times New Roman" w:cs="Times New Roman"/>
           <w:b/>
@@ -2618,8 +2614,7 @@
         </w:tabs>
         <w:autoSpaceDE w:val="0"/>
         <w:autoSpaceDN w:val="0"/>
-        <w:spacing w:before="42" w:after="120" w:line="240" w:lineRule="auto"/>
-        <w:ind w:left="720" w:hanging="120"/>
+        <w:spacing w:before="42" w:after="0" w:line="240" w:lineRule="auto"/>
         <w:rPr>
           <w:rFonts w:ascii="Times New Roman" w:hAnsi="Times New Roman" w:cs="Times New Roman"/>
           <w:b/>
@@ -2806,8 +2801,7 @@
         </w:tabs>
         <w:autoSpaceDE w:val="0"/>
         <w:autoSpaceDN w:val="0"/>
-        <w:spacing w:before="42" w:after="120" w:line="240" w:lineRule="auto"/>
-        <w:ind w:left="720" w:hanging="120"/>
+        <w:spacing w:before="42" w:after="0" w:line="240" w:lineRule="auto"/>
         <w:rPr>
           <w:rFonts w:ascii="Times New Roman" w:hAnsi="Times New Roman" w:cs="Times New Roman"/>
           <w:b/>
@@ -2908,8 +2902,7 @@
         </w:tabs>
         <w:autoSpaceDE w:val="0"/>
         <w:autoSpaceDN w:val="0"/>
-        <w:spacing w:before="42" w:after="120" w:line="240" w:lineRule="auto"/>
-        <w:ind w:left="720" w:hanging="120"/>
+        <w:spacing w:before="42" w:after="0" w:line="240" w:lineRule="auto"/>
         <w:rPr>
           <w:rFonts w:ascii="Times New Roman" w:hAnsi="Times New Roman" w:cs="Times New Roman"/>
           <w:b/>
@@ -3282,8 +3275,7 @@
         </w:tabs>
         <w:autoSpaceDE w:val="0"/>
         <w:autoSpaceDN w:val="0"/>
-        <w:spacing w:before="42" w:after="120" w:line="240" w:lineRule="auto"/>
-        <w:ind w:left="720" w:hanging="120"/>
+        <w:spacing w:before="42" w:after="0" w:line="240" w:lineRule="auto"/>
         <w:rPr>
           <w:rFonts w:ascii="Times New Roman" w:hAnsi="Times New Roman" w:cs="Times New Roman"/>
           <w:b/>
@@ -3520,8 +3512,7 @@
         </w:tabs>
         <w:autoSpaceDE w:val="0"/>
         <w:autoSpaceDN w:val="0"/>
-        <w:spacing w:before="42" w:after="120" w:line="240" w:lineRule="auto"/>
-        <w:ind w:left="720" w:hanging="120"/>
+        <w:spacing w:before="42" w:after="0" w:line="240" w:lineRule="auto"/>
         <w:rPr>
           <w:rFonts w:ascii="Times New Roman" w:hAnsi="Times New Roman" w:cs="Times New Roman"/>
           <w:b/>
@@ -3563,7 +3554,7 @@
       <w:tblPr>
         <w:tblStyle w:val="TableGrid"/>
         <w:tblW w:w="9360" w:type="dxa"/>
-        <w:tblInd w:w="0" w:type="dxa"/>
+        <w:tblInd w:w="-318" w:type="dxa"/>
         <w:tblLayout w:type="fixed"/>
         <w:tblLook w:val="04A0" w:firstRow="1" w:lastRow="0" w:firstColumn="1" w:lastColumn="0" w:noHBand="0" w:noVBand="1"/>
       </w:tblPr>
@@ -4401,8 +4392,7 @@
         </w:tabs>
         <w:autoSpaceDE w:val="0"/>
         <w:autoSpaceDN w:val="0"/>
-        <w:spacing w:before="42" w:after="120" w:line="240" w:lineRule="auto"/>
-        <w:ind w:left="720" w:hanging="120"/>
+        <w:spacing w:before="42" w:after="0" w:line="240" w:lineRule="auto"/>
         <w:rPr>
           <w:rFonts w:ascii="Times New Roman" w:hAnsi="Times New Roman" w:cs="Times New Roman"/>
           <w:b/>
@@ -4422,7 +4412,7 @@
     </w:p>
     <w:p>
       <w:pPr>
-        <w:ind w:left="284" w:right="0"/>
+        <w:ind w:left="284" w:right="-630"/>
         <w:jc w:val="both"/>
         <w:rPr>
           <w:rFonts w:ascii="Times New Roman" w:hAnsi="Times New Roman" w:cs="Times New Roman"/>
@@ -4451,7 +4441,7 @@
     </w:p>
     <w:p>
       <w:pPr>
-        <w:ind w:left="284" w:right="0"/>
+        <w:ind w:left="284" w:right="-630"/>
         <w:jc w:val="both"/>
         <w:rPr>
           <w:rFonts w:ascii="Times New Roman" w:hAnsi="Times New Roman" w:cs="Times New Roman"/>
@@ -4480,7 +4470,7 @@
     </w:p>
     <w:p>
       <w:pPr>
-        <w:ind w:left="284" w:right="0"/>
+        <w:ind w:left="284" w:right="-630"/>
         <w:jc w:val="both"/>
         <w:rPr>
           <w:rFonts w:ascii="Times New Roman" w:hAnsi="Times New Roman" w:cs="Times New Roman"/>
@@ -4509,7 +4499,7 @@
     </w:p>
     <w:p>
       <w:pPr>
-        <w:ind w:left="284" w:right="0"/>
+        <w:ind w:left="284" w:right="-630"/>
         <w:jc w:val="both"/>
         <w:rPr>
           <w:rFonts w:ascii="Times New Roman" w:hAnsi="Times New Roman" w:cs="Times New Roman"/>
@@ -4538,7 +4528,7 @@
     </w:p>
     <w:p>
       <w:pPr>
-        <w:ind w:left="284" w:right="0"/>
+        <w:ind w:left="284" w:right="-630"/>
         <w:jc w:val="both"/>
         <w:rPr>
           <w:rFonts w:ascii="Times New Roman" w:hAnsi="Times New Roman" w:cs="Times New Roman"/>
@@ -4567,7 +4557,7 @@
     </w:p>
     <w:p>
       <w:pPr>
-        <w:ind w:left="284" w:right="0"/>
+        <w:ind w:left="284" w:right="-630"/>
         <w:jc w:val="both"/>
         <w:rPr>
           <w:rFonts w:ascii="Times New Roman" w:hAnsi="Times New Roman" w:cs="Times New Roman"/>
@@ -4596,7 +4586,7 @@
     </w:p>
     <w:p>
       <w:pPr>
-        <w:ind w:left="284" w:right="0"/>
+        <w:ind w:left="284" w:right="-630"/>
         <w:jc w:val="both"/>
         <w:rPr>
           <w:rFonts w:ascii="Times New Roman" w:hAnsi="Times New Roman" w:cs="Times New Roman"/>
@@ -4625,7 +4615,7 @@
     </w:p>
     <w:p>
       <w:pPr>
-        <w:ind w:left="284" w:right="0"/>
+        <w:ind w:left="284" w:right="-630"/>
         <w:jc w:val="both"/>
         <w:rPr>
           <w:rFonts w:ascii="Times New Roman" w:hAnsi="Times New Roman" w:cs="Times New Roman"/>
@@ -4654,7 +4644,7 @@
     </w:p>
     <w:p>
       <w:pPr>
-        <w:ind w:left="284" w:right="0"/>
+        <w:ind w:left="284" w:right="-630"/>
         <w:jc w:val="both"/>
         <w:rPr>
           <w:rFonts w:ascii="Times New Roman" w:hAnsi="Times New Roman" w:cs="Times New Roman"/>
@@ -4683,7 +4673,7 @@
     </w:p>
     <w:p>
       <w:pPr>
-        <w:ind w:left="284" w:right="0"/>
+        <w:ind w:left="284" w:right="-630"/>
         <w:jc w:val="both"/>
         <w:rPr>
           <w:rFonts w:ascii="Times New Roman" w:hAnsi="Times New Roman" w:cs="Times New Roman"/>
@@ -4712,7 +4702,7 @@
     </w:p>
     <w:p>
       <w:pPr>
-        <w:ind w:left="284" w:right="0"/>
+        <w:ind w:left="284" w:right="-630"/>
         <w:jc w:val="both"/>
         <w:rPr>
           <w:rFonts w:ascii="Times New Roman" w:hAnsi="Times New Roman" w:cs="Times New Roman"/>
@@ -4741,7 +4731,7 @@
     </w:p>
     <w:p>
       <w:pPr>
-        <w:ind w:left="284" w:right="0"/>
+        <w:ind w:left="284" w:right="-630"/>
         <w:jc w:val="both"/>
         <w:rPr>
           <w:rFonts w:ascii="Times New Roman" w:hAnsi="Times New Roman" w:cs="Times New Roman"/>
@@ -4770,7 +4760,7 @@
     </w:p>
     <w:p>
       <w:pPr>
-        <w:ind w:left="284" w:right="0"/>
+        <w:ind w:left="284" w:right="-630"/>
         <w:jc w:val="both"/>
         <w:rPr>
           <w:rFonts w:ascii="Times New Roman" w:hAnsi="Times New Roman" w:cs="Times New Roman"/>
@@ -4799,7 +4789,7 @@
     </w:p>
     <w:p>
       <w:pPr>
-        <w:ind w:left="284" w:right="0"/>
+        <w:ind w:left="284" w:right="-630"/>
         <w:jc w:val="both"/>
         <w:rPr>
           <w:rFonts w:ascii="Times New Roman" w:hAnsi="Times New Roman" w:cs="Times New Roman"/>
@@ -4828,7 +4818,7 @@
     </w:p>
     <w:p>
       <w:pPr>
-        <w:ind w:left="284" w:right="0"/>
+        <w:ind w:left="284" w:right="-630"/>
         <w:jc w:val="both"/>
         <w:rPr>
           <w:rFonts w:ascii="Times New Roman" w:hAnsi="Times New Roman" w:cs="Times New Roman"/>
@@ -4857,7 +4847,7 @@
     </w:p>
     <w:p>
       <w:pPr>
-        <w:ind w:left="284" w:right="0"/>
+        <w:ind w:left="284" w:right="-630"/>
         <w:jc w:val="both"/>
         <w:rPr>
           <w:rFonts w:ascii="Times New Roman" w:hAnsi="Times New Roman" w:cs="Times New Roman"/>
@@ -4886,7 +4876,7 @@
     </w:p>
     <w:p>
       <w:pPr>
-        <w:ind w:left="284" w:right="0"/>
+        <w:ind w:left="284" w:right="-630"/>
         <w:jc w:val="both"/>
         <w:rPr>
           <w:rFonts w:ascii="Times New Roman" w:hAnsi="Times New Roman" w:cs="Times New Roman"/>
@@ -4915,7 +4905,7 @@
     </w:p>
     <w:p>
       <w:pPr>
-        <w:ind w:left="284" w:right="0"/>
+        <w:ind w:left="284" w:right="-630"/>
         <w:jc w:val="both"/>
         <w:rPr>
           <w:rFonts w:ascii="Times New Roman" w:hAnsi="Times New Roman" w:cs="Times New Roman"/>

</xml_diff>

<commit_message>
Start every topic of the proposal on its own page
Uses w:pageBreakBefore on the cover-following header block, the abstract and
each of the nine numbered sections, rather than typed page breaks, so the
breaks survive an edit to the text above them.

A spacer paragraph sitting in front of a page break becomes a blank page --
the template pads its cover with empties, and every section here ended with
one. Thirteen of those are now dropped, and a check asserts none comes back.

16 pages, no blank ones; OOXML validator passes.
</commit_message>
<xml_diff>
--- a/output/paper/Project_Proposal.docx
+++ b/output/paper/Project_Proposal.docx
@@ -359,40 +359,8 @@
     </w:p>
     <w:p>
       <w:pPr>
-        <w:ind w:left="-540" w:right="-630"/>
-        <w:jc w:val="center"/>
-        <w:rPr>
-          <w:rFonts w:ascii="Times New Roman" w:hAnsi="Times New Roman" w:cs="Times New Roman"/>
-          <w:b/>
-          <w:sz w:val="36"/>
-        </w:rPr>
-      </w:pPr>
-    </w:p>
-    <w:p>
-      <w:pPr>
-        <w:ind w:left="-540" w:right="-630"/>
-        <w:jc w:val="center"/>
-        <w:rPr>
-          <w:rFonts w:ascii="Times New Roman" w:hAnsi="Times New Roman" w:cs="Times New Roman"/>
-          <w:b/>
-          <w:sz w:val="36"/>
-        </w:rPr>
-      </w:pPr>
-    </w:p>
-    <w:p>
-      <w:pPr>
-        <w:ind w:left="-540" w:right="-630"/>
-        <w:jc w:val="center"/>
-        <w:rPr>
-          <w:rFonts w:ascii="Times New Roman" w:hAnsi="Times New Roman" w:cs="Times New Roman"/>
-          <w:b/>
-          <w:sz w:val="36"/>
-        </w:rPr>
-      </w:pPr>
-    </w:p>
-    <w:p>
-      <w:pPr>
-        <w:pStyle w:val="ListParagraph"/>
+        <w:pStyle w:val="ListParagraph"/>
+        <w:pageBreakBefore/>
         <w:numPr>
           <w:ilvl w:val="0"/>
           <w:numId w:val="1"/>
@@ -1119,18 +1087,7 @@
     <w:p>
       <w:pPr>
         <w:pStyle w:val="ListParagraph"/>
-        <w:spacing w:line="360" w:lineRule="auto"/>
-        <w:jc w:val="both"/>
-        <w:rPr>
-          <w:rFonts w:ascii="Times New Roman" w:hAnsi="Times New Roman" w:cs="Times New Roman"/>
-          <w:sz w:val="24"/>
-          <w:szCs w:val="24"/>
-        </w:rPr>
-      </w:pPr>
-    </w:p>
-    <w:p>
-      <w:pPr>
-        <w:pStyle w:val="ListParagraph"/>
+        <w:pageBreakBefore/>
         <w:spacing w:line="360" w:lineRule="auto"/>
         <w:rPr>
           <w:rFonts w:ascii="Times New Roman" w:hAnsi="Times New Roman" w:cs="Times New Roman"/>
@@ -1225,18 +1182,7 @@
     <w:p>
       <w:pPr>
         <w:pStyle w:val="ListParagraph"/>
-        <w:spacing w:line="360" w:lineRule="auto"/>
-        <w:jc w:val="both"/>
-        <w:rPr>
-          <w:rFonts w:ascii="Times New Roman" w:hAnsi="Times New Roman" w:cs="Times New Roman"/>
-          <w:sz w:val="24"/>
-          <w:szCs w:val="24"/>
-        </w:rPr>
-      </w:pPr>
-    </w:p>
-    <w:p>
-      <w:pPr>
-        <w:pStyle w:val="ListParagraph"/>
+        <w:pageBreakBefore/>
         <w:widowControl w:val="0"/>
         <w:numPr>
           <w:ilvl w:val="0"/>
@@ -1395,18 +1341,7 @@
     <w:p>
       <w:pPr>
         <w:pStyle w:val="ListParagraph"/>
-        <w:spacing w:line="360" w:lineRule="auto"/>
-        <w:jc w:val="both"/>
-        <w:rPr>
-          <w:rFonts w:ascii="Times New Roman" w:hAnsi="Times New Roman" w:cs="Times New Roman"/>
-          <w:sz w:val="24"/>
-          <w:szCs w:val="24"/>
-        </w:rPr>
-      </w:pPr>
-    </w:p>
-    <w:p>
-      <w:pPr>
-        <w:pStyle w:val="ListParagraph"/>
+        <w:pageBreakBefore/>
         <w:widowControl w:val="0"/>
         <w:numPr>
           <w:ilvl w:val="0"/>
@@ -1960,18 +1895,7 @@
     <w:p>
       <w:pPr>
         <w:pStyle w:val="ListParagraph"/>
-        <w:spacing w:line="360" w:lineRule="auto"/>
-        <w:jc w:val="both"/>
-        <w:rPr>
-          <w:rFonts w:ascii="Times New Roman" w:hAnsi="Times New Roman" w:cs="Times New Roman"/>
-          <w:sz w:val="24"/>
-          <w:szCs w:val="24"/>
-        </w:rPr>
-      </w:pPr>
-    </w:p>
-    <w:p>
-      <w:pPr>
-        <w:pStyle w:val="ListParagraph"/>
+        <w:pageBreakBefore/>
         <w:widowControl w:val="0"/>
         <w:numPr>
           <w:ilvl w:val="0"/>
@@ -2592,18 +2516,7 @@
     <w:p>
       <w:pPr>
         <w:pStyle w:val="ListParagraph"/>
-        <w:spacing w:line="360" w:lineRule="auto"/>
-        <w:jc w:val="both"/>
-        <w:rPr>
-          <w:rFonts w:ascii="Times New Roman" w:hAnsi="Times New Roman" w:cs="Times New Roman"/>
-          <w:sz w:val="24"/>
-          <w:szCs w:val="24"/>
-        </w:rPr>
-      </w:pPr>
-    </w:p>
-    <w:p>
-      <w:pPr>
-        <w:pStyle w:val="ListParagraph"/>
+        <w:pageBreakBefore/>
         <w:widowControl w:val="0"/>
         <w:numPr>
           <w:ilvl w:val="0"/>
@@ -2779,18 +2692,7 @@
     <w:p>
       <w:pPr>
         <w:pStyle w:val="ListParagraph"/>
-        <w:spacing w:line="360" w:lineRule="auto"/>
-        <w:jc w:val="both"/>
-        <w:rPr>
-          <w:rFonts w:ascii="Times New Roman" w:hAnsi="Times New Roman" w:cs="Times New Roman"/>
-          <w:sz w:val="24"/>
-          <w:szCs w:val="24"/>
-        </w:rPr>
-      </w:pPr>
-    </w:p>
-    <w:p>
-      <w:pPr>
-        <w:pStyle w:val="ListParagraph"/>
+        <w:pageBreakBefore/>
         <w:widowControl w:val="0"/>
         <w:numPr>
           <w:ilvl w:val="0"/>
@@ -2880,18 +2782,7 @@
     <w:p>
       <w:pPr>
         <w:pStyle w:val="ListParagraph"/>
-        <w:spacing w:line="360" w:lineRule="auto"/>
-        <w:jc w:val="both"/>
-        <w:rPr>
-          <w:rFonts w:ascii="Times New Roman" w:hAnsi="Times New Roman" w:cs="Times New Roman"/>
-          <w:sz w:val="24"/>
-          <w:szCs w:val="24"/>
-        </w:rPr>
-      </w:pPr>
-    </w:p>
-    <w:p>
-      <w:pPr>
-        <w:pStyle w:val="ListParagraph"/>
+        <w:pageBreakBefore/>
         <w:widowControl w:val="0"/>
         <w:numPr>
           <w:ilvl w:val="0"/>
@@ -3253,18 +3144,7 @@
     <w:p>
       <w:pPr>
         <w:pStyle w:val="ListParagraph"/>
-        <w:spacing w:line="360" w:lineRule="auto"/>
-        <w:jc w:val="both"/>
-        <w:rPr>
-          <w:rFonts w:ascii="Times New Roman" w:hAnsi="Times New Roman" w:cs="Times New Roman"/>
-          <w:sz w:val="24"/>
-          <w:szCs w:val="24"/>
-        </w:rPr>
-      </w:pPr>
-    </w:p>
-    <w:p>
-      <w:pPr>
-        <w:pStyle w:val="ListParagraph"/>
+        <w:pageBreakBefore/>
         <w:widowControl w:val="0"/>
         <w:numPr>
           <w:ilvl w:val="0"/>
@@ -3490,18 +3370,7 @@
     <w:p>
       <w:pPr>
         <w:pStyle w:val="ListParagraph"/>
-        <w:spacing w:line="360" w:lineRule="auto"/>
-        <w:jc w:val="both"/>
-        <w:rPr>
-          <w:rFonts w:ascii="Times New Roman" w:hAnsi="Times New Roman" w:cs="Times New Roman"/>
-          <w:sz w:val="24"/>
-          <w:szCs w:val="24"/>
-        </w:rPr>
-      </w:pPr>
-    </w:p>
-    <w:p>
-      <w:pPr>
-        <w:pStyle w:val="ListParagraph"/>
+        <w:pageBreakBefore/>
         <w:widowControl w:val="0"/>
         <w:numPr>
           <w:ilvl w:val="0"/>
@@ -4370,18 +4239,7 @@
     <w:p>
       <w:pPr>
         <w:pStyle w:val="ListParagraph"/>
-        <w:spacing w:line="360" w:lineRule="auto"/>
-        <w:jc w:val="both"/>
-        <w:rPr>
-          <w:rFonts w:ascii="Times New Roman" w:hAnsi="Times New Roman" w:cs="Times New Roman"/>
-          <w:sz w:val="24"/>
-          <w:szCs w:val="24"/>
-        </w:rPr>
-      </w:pPr>
-    </w:p>
-    <w:p>
-      <w:pPr>
-        <w:pStyle w:val="ListParagraph"/>
+        <w:pageBreakBefore/>
         <w:widowControl w:val="0"/>
         <w:numPr>
           <w:ilvl w:val="0"/>

</xml_diff>